<commit_message>
fix(task): update and delete task
</commit_message>
<xml_diff>
--- a/server/src/controllers/templateSPT.docx
+++ b/server/src/controllers/templateSPT.docx
@@ -1133,6 +1133,13 @@
               </w:rPr>
               <w:t>{#pegawai}</w:t>
             </w:r>
+            <w:r>
+              <w:rPr>
+                <w:rFonts w:ascii="Arial" w:eastAsia="Tahoma" w:hAnsi="Arial" w:cs="Arial"/>
+                <w:noProof/>
+              </w:rPr>
+              <w:t>{labelKepada}</w:t>
+            </w:r>
           </w:p>
         </w:tc>
         <w:tc>
@@ -1338,7 +1345,30 @@
                 <w:noProof/>
                 <w:lang w:val="id-ID"/>
               </w:rPr>
-              <w:t xml:space="preserve">{showNIP} </w:t>
+              <w:t>{</w:t>
+            </w:r>
+            <w:r>
+              <w:rPr>
+                <w:rFonts w:ascii="Arial" w:eastAsia="Tahoma" w:hAnsi="Arial" w:cs="Arial"/>
+                <w:noProof/>
+                <w:lang w:val="id-ID"/>
+              </w:rPr>
+              <w:t>#</w:t>
+            </w:r>
+            <w:r>
+              <w:rPr>
+                <w:rFonts w:ascii="Arial" w:eastAsia="Tahoma" w:hAnsi="Arial" w:cs="Arial"/>
+                <w:noProof/>
+              </w:rPr>
+              <w:t>isASN</w:t>
+            </w:r>
+            <w:r>
+              <w:rPr>
+                <w:rFonts w:ascii="Arial" w:eastAsia="Tahoma" w:hAnsi="Arial" w:cs="Arial"/>
+                <w:noProof/>
+                <w:lang w:val="id-ID"/>
+              </w:rPr>
+              <w:t xml:space="preserve">} </w:t>
             </w:r>
             <w:r>
               <w:rPr>
@@ -1394,7 +1424,22 @@
                 <w:noProof/>
                 <w:lang w:val="id-ID"/>
               </w:rPr>
-              <w:t>{nip} {/showNIP}</w:t>
+              <w:t>{nip} {/</w:t>
+            </w:r>
+            <w:r>
+              <w:rPr>
+                <w:rFonts w:ascii="Arial" w:eastAsia="Tahoma" w:hAnsi="Arial" w:cs="Arial"/>
+                <w:noProof/>
+              </w:rPr>
+              <w:t>isASN</w:t>
+            </w:r>
+            <w:r>
+              <w:rPr>
+                <w:rFonts w:ascii="Arial" w:eastAsia="Tahoma" w:hAnsi="Arial" w:cs="Arial"/>
+                <w:noProof/>
+                <w:lang w:val="id-ID"/>
+              </w:rPr>
+              <w:t>}</w:t>
             </w:r>
           </w:p>
         </w:tc>
@@ -1465,7 +1510,22 @@
                 <w:noProof/>
                 <w:lang w:val="id-ID"/>
               </w:rPr>
-              <w:t xml:space="preserve">{showPangkat} </w:t>
+              <w:t>{#</w:t>
+            </w:r>
+            <w:r>
+              <w:rPr>
+                <w:rFonts w:ascii="Arial" w:eastAsia="Tahoma" w:hAnsi="Arial" w:cs="Arial"/>
+                <w:noProof/>
+              </w:rPr>
+              <w:t>isASN</w:t>
+            </w:r>
+            <w:r>
+              <w:rPr>
+                <w:rFonts w:ascii="Arial" w:eastAsia="Tahoma" w:hAnsi="Arial" w:cs="Arial"/>
+                <w:noProof/>
+                <w:lang w:val="id-ID"/>
+              </w:rPr>
+              <w:t xml:space="preserve">} </w:t>
             </w:r>
             <w:r>
               <w:rPr>
@@ -1521,7 +1581,38 @@
                 <w:noProof/>
                 <w:lang w:val="id-ID"/>
               </w:rPr>
-              <w:t>{pangkat} {/showPangkat}</w:t>
+              <w:t xml:space="preserve">{pangkat} </w:t>
+            </w:r>
+            <w:r>
+              <w:rPr>
+                <w:rFonts w:ascii="Arial" w:eastAsia="Tahoma" w:hAnsi="Arial" w:cs="Arial"/>
+                <w:noProof/>
+                <w:lang w:val="id-ID"/>
+              </w:rPr>
+              <w:t>{/</w:t>
+            </w:r>
+            <w:r>
+              <w:rPr>
+                <w:rFonts w:ascii="Arial" w:eastAsia="Tahoma" w:hAnsi="Arial" w:cs="Arial"/>
+                <w:noProof/>
+              </w:rPr>
+              <w:t>isASN</w:t>
+            </w:r>
+            <w:r>
+              <w:rPr>
+                <w:rFonts w:ascii="Arial" w:eastAsia="Tahoma" w:hAnsi="Arial" w:cs="Arial"/>
+                <w:noProof/>
+                <w:lang w:val="id-ID"/>
+              </w:rPr>
+              <w:t>}</w:t>
+            </w:r>
+            <w:r>
+              <w:rPr>
+                <w:rFonts w:ascii="Arial" w:eastAsia="Tahoma" w:hAnsi="Arial" w:cs="Arial"/>
+                <w:noProof/>
+                <w:lang w:val="id-ID"/>
+              </w:rPr>
+              <w:t>}</w:t>
             </w:r>
           </w:p>
         </w:tc>
@@ -8396,7 +8487,6 @@
   <w:style w:type="character" w:default="1" w:styleId="FontParagrafDefault">
     <w:name w:val="Default Paragraph Font"/>
     <w:uiPriority w:val="1"/>
-    <w:semiHidden/>
     <w:unhideWhenUsed/>
   </w:style>
   <w:style w:type="table" w:default="1" w:styleId="TabelNormal">

</xml_diff>

<commit_message>
feat(event): generate SPT (docx to docx)
</commit_message>
<xml_diff>
--- a/server/src/controllers/templateSPT.docx
+++ b/server/src/controllers/templateSPT.docx
@@ -1131,14 +1131,133 @@
                 <w:rFonts w:ascii="Arial" w:eastAsia="Tahoma" w:hAnsi="Arial" w:cs="Arial"/>
                 <w:noProof/>
               </w:rPr>
-              <w:t>{#pegawai}</w:t>
+              <w:t>[[#pegawai]]</w:t>
+            </w:r>
+          </w:p>
+        </w:tc>
+        <w:tc>
+          <w:tcPr>
+            <w:tcW w:w="291" w:type="dxa"/>
+          </w:tcPr>
+          <w:p>
+            <w:pPr>
+              <w:spacing w:before="60" w:line="276" w:lineRule="auto"/>
+              <w:rPr>
+                <w:rFonts w:ascii="Arial" w:hAnsi="Arial" w:cs="Arial"/>
+                <w:noProof/>
+              </w:rPr>
+            </w:pPr>
+          </w:p>
+        </w:tc>
+        <w:tc>
+          <w:tcPr>
+            <w:tcW w:w="417" w:type="dxa"/>
+          </w:tcPr>
+          <w:p>
+            <w:pPr>
+              <w:spacing w:before="60" w:line="276" w:lineRule="auto"/>
+              <w:rPr>
+                <w:rFonts w:ascii="Arial" w:hAnsi="Arial" w:cs="Arial"/>
+                <w:noProof/>
+                <w:lang w:val="id-ID"/>
+              </w:rPr>
+            </w:pPr>
+          </w:p>
+        </w:tc>
+        <w:tc>
+          <w:tcPr>
+            <w:tcW w:w="1560" w:type="dxa"/>
+          </w:tcPr>
+          <w:p>
+            <w:pPr>
+              <w:spacing w:before="60" w:line="276" w:lineRule="auto"/>
+              <w:jc w:val="both"/>
+              <w:rPr>
+                <w:rFonts w:ascii="Arial" w:eastAsia="Tahoma" w:hAnsi="Arial" w:cs="Arial"/>
+                <w:noProof/>
+              </w:rPr>
+            </w:pPr>
+          </w:p>
+        </w:tc>
+        <w:tc>
+          <w:tcPr>
+            <w:tcW w:w="236" w:type="dxa"/>
+          </w:tcPr>
+          <w:p>
+            <w:pPr>
+              <w:spacing w:before="60" w:line="276" w:lineRule="auto"/>
+              <w:jc w:val="both"/>
+              <w:rPr>
+                <w:rFonts w:ascii="Arial" w:eastAsia="Tahoma" w:hAnsi="Arial" w:cs="Arial"/>
+                <w:noProof/>
+              </w:rPr>
+            </w:pPr>
+          </w:p>
+        </w:tc>
+        <w:tc>
+          <w:tcPr>
+            <w:tcW w:w="5859" w:type="dxa"/>
+          </w:tcPr>
+          <w:p>
+            <w:pPr>
+              <w:spacing w:before="60" w:line="276" w:lineRule="auto"/>
+              <w:jc w:val="both"/>
+              <w:rPr>
+                <w:rFonts w:ascii="Arial" w:eastAsia="Tahoma" w:hAnsi="Arial" w:cs="Arial"/>
+                <w:noProof/>
+                <w:lang w:val="id-ID"/>
+              </w:rPr>
+            </w:pPr>
+          </w:p>
+        </w:tc>
+      </w:tr>
+      <w:tr>
+        <w:tc>
+          <w:tcPr>
+            <w:tcW w:w="1418" w:type="dxa"/>
+          </w:tcPr>
+          <w:p>
+            <w:pPr>
+              <w:spacing w:before="60" w:line="276" w:lineRule="auto"/>
+              <w:rPr>
+                <w:rFonts w:ascii="Arial" w:eastAsia="Tahoma" w:hAnsi="Arial" w:cs="Arial"/>
+                <w:noProof/>
+              </w:rPr>
+            </w:pPr>
+            <w:r>
+              <w:rPr>
+                <w:rFonts w:ascii="Arial" w:eastAsia="Tahoma" w:hAnsi="Arial" w:cs="Arial"/>
+                <w:noProof/>
+              </w:rPr>
+              <w:t>[[#first]]</w:t>
             </w:r>
             <w:r>
               <w:rPr>
                 <w:rFonts w:ascii="Arial" w:eastAsia="Tahoma" w:hAnsi="Arial" w:cs="Arial"/>
                 <w:noProof/>
               </w:rPr>
-              <w:t>{labelKepada}</w:t>
+              <w:t>[[</w:t>
+            </w:r>
+            <w:r>
+              <w:rPr>
+                <w:rFonts w:ascii="Arial" w:eastAsia="Tahoma" w:hAnsi="Arial" w:cs="Arial"/>
+                <w:noProof/>
+              </w:rPr>
+              <w:t>labelKepada</w:t>
+            </w:r>
+            <w:r>
+              <w:rPr>
+                <w:rFonts w:ascii="Arial" w:eastAsia="Tahoma" w:hAnsi="Arial" w:cs="Arial"/>
+                <w:noProof/>
+              </w:rPr>
+              <w:t>]]</w:t>
+            </w:r>
+            <w:r>
+              <w:rPr>
+                <w:rFonts w:ascii="Arial" w:eastAsia="Tahoma" w:hAnsi="Arial" w:cs="Arial"/>
+                <w:noProof/>
+              </w:rPr>
+              <w:t>[[/first]]</w:t>
             </w:r>
           </w:p>
         </w:tc>
@@ -1182,7 +1301,7 @@
                 <w:noProof/>
                 <w:lang w:val="id-ID"/>
               </w:rPr>
-              <w:t>{n</w:t>
+              <w:t>[</w:t>
             </w:r>
             <w:r>
               <w:rPr>
@@ -1190,7 +1309,16 @@
                 <w:noProof/>
                 <w:lang w:val="id-ID"/>
               </w:rPr>
-              <w:t>o}</w:t>
+              <w:t>[n</w:t>
+            </w:r>
+            <w:r>
+              <w:rPr>
+                <w:rFonts w:ascii="Arial" w:hAnsi="Arial" w:cs="Arial"/>
+                <w:noProof/>
+                <w:lang w:val="id-ID"/>
+              </w:rPr>
+              <w:lastRenderedPageBreak/>
+              <w:t>o]]</w:t>
             </w:r>
             <w:r>
               <w:rPr>
@@ -1220,6 +1348,7 @@
                 <w:rFonts w:ascii="Arial" w:eastAsia="Tahoma" w:hAnsi="Arial" w:cs="Arial"/>
                 <w:noProof/>
               </w:rPr>
+              <w:lastRenderedPageBreak/>
               <w:t>Nama</w:t>
             </w:r>
           </w:p>
@@ -1266,7 +1395,7 @@
                 <w:noProof/>
                 <w:lang w:val="id-ID"/>
               </w:rPr>
-              <w:t>{nama}</w:t>
+              <w:t>[[</w:t>
             </w:r>
             <w:r>
               <w:rPr>
@@ -1274,7 +1403,23 @@
                 <w:noProof/>
                 <w:lang w:val="id-ID"/>
               </w:rPr>
-              <w:t>.</w:t>
+              <w:t>nam</w:t>
+            </w:r>
+            <w:r>
+              <w:rPr>
+                <w:rFonts w:ascii="Arial" w:eastAsia="Tahoma" w:hAnsi="Arial" w:cs="Arial"/>
+                <w:noProof/>
+                <w:lang w:val="id-ID"/>
+              </w:rPr>
+              <w:t>e</w:t>
+            </w:r>
+            <w:r>
+              <w:rPr>
+                <w:rFonts w:ascii="Arial" w:eastAsia="Tahoma" w:hAnsi="Arial" w:cs="Arial"/>
+                <w:noProof/>
+                <w:lang w:val="id-ID"/>
+              </w:rPr>
+              <w:t>]]</w:t>
             </w:r>
           </w:p>
         </w:tc>
@@ -1345,30 +1490,7 @@
                 <w:noProof/>
                 <w:lang w:val="id-ID"/>
               </w:rPr>
-              <w:t>{</w:t>
-            </w:r>
-            <w:r>
-              <w:rPr>
-                <w:rFonts w:ascii="Arial" w:eastAsia="Tahoma" w:hAnsi="Arial" w:cs="Arial"/>
-                <w:noProof/>
-                <w:lang w:val="id-ID"/>
-              </w:rPr>
-              <w:t>#</w:t>
-            </w:r>
-            <w:r>
-              <w:rPr>
-                <w:rFonts w:ascii="Arial" w:eastAsia="Tahoma" w:hAnsi="Arial" w:cs="Arial"/>
-                <w:noProof/>
-              </w:rPr>
-              <w:t>isASN</w:t>
-            </w:r>
-            <w:r>
-              <w:rPr>
-                <w:rFonts w:ascii="Arial" w:eastAsia="Tahoma" w:hAnsi="Arial" w:cs="Arial"/>
-                <w:noProof/>
-                <w:lang w:val="id-ID"/>
-              </w:rPr>
-              <w:t xml:space="preserve">} </w:t>
+              <w:t>[[#nip]]</w:t>
             </w:r>
             <w:r>
               <w:rPr>
@@ -1424,22 +1546,7 @@
                 <w:noProof/>
                 <w:lang w:val="id-ID"/>
               </w:rPr>
-              <w:t>{nip} {/</w:t>
-            </w:r>
-            <w:r>
-              <w:rPr>
-                <w:rFonts w:ascii="Arial" w:eastAsia="Tahoma" w:hAnsi="Arial" w:cs="Arial"/>
-                <w:noProof/>
-              </w:rPr>
-              <w:t>isASN</w:t>
-            </w:r>
-            <w:r>
-              <w:rPr>
-                <w:rFonts w:ascii="Arial" w:eastAsia="Tahoma" w:hAnsi="Arial" w:cs="Arial"/>
-                <w:noProof/>
-                <w:lang w:val="id-ID"/>
-              </w:rPr>
-              <w:t>}</w:t>
+              <w:t>[[nip]][[/nip]]</w:t>
             </w:r>
           </w:p>
         </w:tc>
@@ -1510,22 +1617,7 @@
                 <w:noProof/>
                 <w:lang w:val="id-ID"/>
               </w:rPr>
-              <w:t>{#</w:t>
-            </w:r>
-            <w:r>
-              <w:rPr>
-                <w:rFonts w:ascii="Arial" w:eastAsia="Tahoma" w:hAnsi="Arial" w:cs="Arial"/>
-                <w:noProof/>
-              </w:rPr>
-              <w:t>isASN</w:t>
-            </w:r>
-            <w:r>
-              <w:rPr>
-                <w:rFonts w:ascii="Arial" w:eastAsia="Tahoma" w:hAnsi="Arial" w:cs="Arial"/>
-                <w:noProof/>
-                <w:lang w:val="id-ID"/>
-              </w:rPr>
-              <w:t xml:space="preserve">} </w:t>
+              <w:t>[[#pangkat]]</w:t>
             </w:r>
             <w:r>
               <w:rPr>
@@ -1581,38 +1673,7 @@
                 <w:noProof/>
                 <w:lang w:val="id-ID"/>
               </w:rPr>
-              <w:t xml:space="preserve">{pangkat} </w:t>
-            </w:r>
-            <w:r>
-              <w:rPr>
-                <w:rFonts w:ascii="Arial" w:eastAsia="Tahoma" w:hAnsi="Arial" w:cs="Arial"/>
-                <w:noProof/>
-                <w:lang w:val="id-ID"/>
-              </w:rPr>
-              <w:t>{/</w:t>
-            </w:r>
-            <w:r>
-              <w:rPr>
-                <w:rFonts w:ascii="Arial" w:eastAsia="Tahoma" w:hAnsi="Arial" w:cs="Arial"/>
-                <w:noProof/>
-              </w:rPr>
-              <w:t>isASN</w:t>
-            </w:r>
-            <w:r>
-              <w:rPr>
-                <w:rFonts w:ascii="Arial" w:eastAsia="Tahoma" w:hAnsi="Arial" w:cs="Arial"/>
-                <w:noProof/>
-                <w:lang w:val="id-ID"/>
-              </w:rPr>
-              <w:t>}</w:t>
-            </w:r>
-            <w:r>
-              <w:rPr>
-                <w:rFonts w:ascii="Arial" w:eastAsia="Tahoma" w:hAnsi="Arial" w:cs="Arial"/>
-                <w:noProof/>
-                <w:lang w:val="id-ID"/>
-              </w:rPr>
-              <w:t>}</w:t>
+              <w:t>[[pangkat]][[/pangkat]]</w:t>
             </w:r>
           </w:p>
         </w:tc>
@@ -1727,7 +1788,7 @@
               <w:rPr>
                 <w:rFonts w:ascii="Arial" w:hAnsi="Arial" w:cs="Arial"/>
               </w:rPr>
-              <w:t>{</w:t>
+              <w:t>[[</w:t>
             </w:r>
             <w:proofErr w:type="spellStart"/>
             <w:r>
@@ -1741,22 +1802,123 @@
               <w:rPr>
                 <w:rFonts w:ascii="Arial" w:hAnsi="Arial" w:cs="Arial"/>
               </w:rPr>
-              <w:t>} {/</w:t>
+              <w:t>]]</w:t>
             </w:r>
-            <w:proofErr w:type="spellStart"/>
             <w:r>
               <w:rPr>
                 <w:rFonts w:ascii="Arial" w:hAnsi="Arial" w:cs="Arial"/>
               </w:rPr>
-              <w:t>pegawai</w:t>
+              <w:t xml:space="preserve"> </w:t>
             </w:r>
-            <w:proofErr w:type="spellEnd"/>
             <w:r>
               <w:rPr>
+                <w:rFonts w:ascii="Arial" w:eastAsia="Tahoma" w:hAnsi="Arial" w:cs="Arial"/>
+                <w:noProof/>
+              </w:rPr>
+              <w:t>Pada Subdit Sistem Informasi Administrasi Kependudukan pada Direktorat Pengelolaan Informasi Administrasi Kependudukan</w:t>
+            </w:r>
+          </w:p>
+        </w:tc>
+      </w:tr>
+      <w:tr>
+        <w:trPr>
+          <w:trHeight w:val="195"/>
+        </w:trPr>
+        <w:tc>
+          <w:tcPr>
+            <w:tcW w:w="1418" w:type="dxa"/>
+          </w:tcPr>
+          <w:p>
+            <w:pPr>
+              <w:spacing w:before="60" w:line="276" w:lineRule="auto"/>
+              <w:rPr>
+                <w:rFonts w:ascii="Arial" w:eastAsia="Tahoma" w:hAnsi="Arial" w:cs="Arial"/>
+                <w:noProof/>
+              </w:rPr>
+            </w:pPr>
+            <w:r>
+              <w:rPr>
+                <w:rFonts w:ascii="Arial" w:eastAsia="Tahoma" w:hAnsi="Arial" w:cs="Arial"/>
+                <w:noProof/>
+              </w:rPr>
+              <w:t>[[/pegawai]]</w:t>
+            </w:r>
+          </w:p>
+        </w:tc>
+        <w:tc>
+          <w:tcPr>
+            <w:tcW w:w="291" w:type="dxa"/>
+          </w:tcPr>
+          <w:p>
+            <w:pPr>
+              <w:spacing w:before="60" w:line="276" w:lineRule="auto"/>
+              <w:rPr>
                 <w:rFonts w:ascii="Arial" w:hAnsi="Arial" w:cs="Arial"/>
-              </w:rPr>
-              <w:t>}</w:t>
-            </w:r>
+                <w:noProof/>
+              </w:rPr>
+            </w:pPr>
+          </w:p>
+        </w:tc>
+        <w:tc>
+          <w:tcPr>
+            <w:tcW w:w="417" w:type="dxa"/>
+          </w:tcPr>
+          <w:p>
+            <w:pPr>
+              <w:pStyle w:val="DaftarParagraf"/>
+              <w:spacing w:before="60" w:line="276" w:lineRule="auto"/>
+              <w:ind w:left="174"/>
+              <w:contextualSpacing w:val="0"/>
+              <w:jc w:val="center"/>
+              <w:rPr>
+                <w:rFonts w:ascii="Arial" w:hAnsi="Arial" w:cs="Arial"/>
+                <w:noProof/>
+              </w:rPr>
+            </w:pPr>
+          </w:p>
+        </w:tc>
+        <w:tc>
+          <w:tcPr>
+            <w:tcW w:w="1560" w:type="dxa"/>
+          </w:tcPr>
+          <w:p>
+            <w:pPr>
+              <w:spacing w:before="60" w:line="276" w:lineRule="auto"/>
+              <w:jc w:val="both"/>
+              <w:rPr>
+                <w:rFonts w:ascii="Arial" w:eastAsia="Tahoma" w:hAnsi="Arial" w:cs="Arial"/>
+                <w:noProof/>
+              </w:rPr>
+            </w:pPr>
+          </w:p>
+        </w:tc>
+        <w:tc>
+          <w:tcPr>
+            <w:tcW w:w="236" w:type="dxa"/>
+          </w:tcPr>
+          <w:p>
+            <w:pPr>
+              <w:spacing w:before="60" w:line="276" w:lineRule="auto"/>
+              <w:jc w:val="both"/>
+              <w:rPr>
+                <w:rFonts w:ascii="Arial" w:eastAsia="Tahoma" w:hAnsi="Arial" w:cs="Arial"/>
+                <w:noProof/>
+              </w:rPr>
+            </w:pPr>
+          </w:p>
+        </w:tc>
+        <w:tc>
+          <w:tcPr>
+            <w:tcW w:w="5859" w:type="dxa"/>
+          </w:tcPr>
+          <w:p>
+            <w:pPr>
+              <w:spacing w:before="60" w:line="276" w:lineRule="auto"/>
+              <w:jc w:val="both"/>
+              <w:rPr>
+                <w:rFonts w:ascii="Arial" w:hAnsi="Arial" w:cs="Arial"/>
+              </w:rPr>
+            </w:pPr>
           </w:p>
         </w:tc>
       </w:tr>
@@ -1852,7 +2014,15 @@
                 <w:noProof/>
                 <w:lang w:val="id-ID"/>
               </w:rPr>
-              <w:t xml:space="preserve"> {agenda}</w:t>
+              <w:t xml:space="preserve"> </w:t>
+            </w:r>
+            <w:r>
+              <w:rPr>
+                <w:rFonts w:ascii="Arial" w:eastAsia="Tahoma" w:hAnsi="Arial" w:cs="Arial"/>
+                <w:noProof/>
+                <w:lang w:val="id-ID"/>
+              </w:rPr>
+              <w:t>[[agenda]]</w:t>
             </w:r>
             <w:r>
               <w:rPr>
@@ -1868,7 +2038,7 @@
                 <w:noProof/>
                 <w:lang w:val="id-ID"/>
               </w:rPr>
-              <w:t xml:space="preserve">{lokasi} </w:t>
+              <w:t xml:space="preserve">[[lokasi]] </w:t>
             </w:r>
             <w:r>
               <w:rPr>
@@ -1876,7 +2046,7 @@
                 <w:noProof/>
                 <w:lang w:val="id-ID"/>
               </w:rPr>
-              <w:t xml:space="preserve"> selama </w:t>
+              <w:t xml:space="preserve">selama </w:t>
             </w:r>
             <w:r>
               <w:rPr>
@@ -1884,7 +2054,15 @@
                 <w:noProof/>
                 <w:lang w:val="id-ID"/>
               </w:rPr>
-              <w:t xml:space="preserve">{durasi} </w:t>
+              <w:t>[[durasi]]</w:t>
+            </w:r>
+            <w:r>
+              <w:rPr>
+                <w:rFonts w:ascii="Arial" w:eastAsia="Tahoma" w:hAnsi="Arial" w:cs="Arial"/>
+                <w:noProof/>
+                <w:lang w:val="id-ID"/>
+              </w:rPr>
+              <w:t xml:space="preserve"> </w:t>
             </w:r>
             <w:r>
               <w:rPr>
@@ -1900,7 +2078,15 @@
                 <w:noProof/>
                 <w:lang w:val="id-ID"/>
               </w:rPr>
-              <w:t>{tanggal};</w:t>
+              <w:t>[[tanggal]]</w:t>
+            </w:r>
+            <w:r>
+              <w:rPr>
+                <w:rFonts w:ascii="Arial" w:eastAsia="Tahoma" w:hAnsi="Arial" w:cs="Arial"/>
+                <w:noProof/>
+                <w:lang w:val="id-ID"/>
+              </w:rPr>
+              <w:t>;</w:t>
             </w:r>
           </w:p>
         </w:tc>
@@ -2509,7 +2695,15 @@
           <w:noProof/>
           <w:lang w:val="id-ID"/>
         </w:rPr>
-        <w:t>{lokasi};</w:t>
+        <w:t>[[lokasi]]</w:t>
+      </w:r>
+      <w:r>
+        <w:rPr>
+          <w:rFonts w:ascii="Arial" w:eastAsia="Tahoma" w:hAnsi="Arial" w:cs="Arial"/>
+          <w:noProof/>
+          <w:lang w:val="id-ID"/>
+        </w:rPr>
+        <w:t>;</w:t>
       </w:r>
     </w:p>
     <w:p>
@@ -8487,6 +8681,7 @@
   <w:style w:type="character" w:default="1" w:styleId="FontParagrafDefault">
     <w:name w:val="Default Paragraph Font"/>
     <w:uiPriority w:val="1"/>
+    <w:semiHidden/>
     <w:unhideWhenUsed/>
   </w:style>
   <w:style w:type="table" w:default="1" w:styleId="TabelNormal">

</xml_diff>